<commit_message>
gitignore + modifiche documento
</commit_message>
<xml_diff>
--- a/Progetto22ICT.docx
+++ b/Progetto22ICT.docx
@@ -7,10 +7,7 @@
         <w:pStyle w:val="Titolo1"/>
       </w:pPr>
       <w:r>
-        <w:t xml:space="preserve">Documentazione progetto 22: </w:t>
-      </w:r>
-      <w:r>
-        <w:t>RubberDucky</w:t>
+        <w:t>Documentazione progetto 22: RubberDucky</w:t>
       </w:r>
     </w:p>
     <w:p>
@@ -21,13 +18,7 @@
         <w:t>1</w:t>
       </w:r>
       <w:r>
-        <w:t>. Preparare</w:t>
-      </w:r>
-      <w:r>
-        <w:t xml:space="preserve"> </w:t>
-      </w:r>
-      <w:r>
-        <w:t>una demo e documentare il tutto</w:t>
+        <w:t>. Preparare una demo e documentare il tutto</w:t>
       </w:r>
     </w:p>
     <w:p/>
@@ -43,6 +34,32 @@
     </w:p>
     <w:p/>
     <w:p>
+      <w:hyperlink r:id="rId7" w:history="1">
+        <w:r>
+          <w:rPr>
+            <w:rStyle w:val="Collegamentoipertestuale"/>
+          </w:rPr>
+          <w:t>https://payloadstudio.com/community/</w:t>
+        </w:r>
+      </w:hyperlink>
+    </w:p>
+    <w:p/>
+    <w:p>
+      <w:r>
+        <w:t>In ogni caso cercare come installare. In più vorrei farti creare un bridge tramite rete ethernet</w:t>
+      </w:r>
+      <w:r>
+        <w:t>:</w:t>
+      </w:r>
+    </w:p>
+    <w:p/>
+    <w:p>
+      <w:r>
+        <w:t>Rubber ducky invia comandi come se fosse una tastiera. Quindi sarebbe bello che spedisca via Ethernet il risultato dei comandi a qualche server. Il livello 2 dell'esperienza consiste nel connettersi via rete al hardware Raspberry e digitare remotamente i comandi invece che avere delle procedure scritte e preconfezionate. Prova a guardare in questa direzione così ne esce un'esperienza bella completa</w:t>
+      </w:r>
+    </w:p>
+    <w:p/>
+    <w:p>
       <w:proofErr w:type="gramStart"/>
       <w:r>
         <w:rPr>
@@ -253,7 +270,7 @@
       </w:r>
     </w:p>
     <w:sectPr>
-      <w:headerReference w:type="default" r:id="rId7"/>
+      <w:headerReference w:type="default" r:id="rId8"/>
       <w:pgSz w:w="11906" w:h="16838"/>
       <w:pgMar w:top="1417" w:right="1134" w:bottom="1134" w:left="1134" w:header="708" w:footer="708" w:gutter="0"/>
       <w:cols w:space="708"/>
@@ -1312,6 +1329,18 @@
       <w:bCs/>
     </w:rPr>
   </w:style>
+  <w:style w:type="character" w:styleId="Collegamentovisitato">
+    <w:name w:val="FollowedHyperlink"/>
+    <w:basedOn w:val="Carpredefinitoparagrafo"/>
+    <w:uiPriority w:val="99"/>
+    <w:semiHidden/>
+    <w:unhideWhenUsed/>
+    <w:rsid w:val="00C11CDD"/>
+    <w:rPr>
+      <w:color w:val="96607D" w:themeColor="followedHyperlink"/>
+      <w:u w:val="single"/>
+    </w:rPr>
+  </w:style>
 </w:styles>
 </file>
 

</xml_diff>